<commit_message>
docs:Adiciona altualizações no documento de especificação
</commit_message>
<xml_diff>
--- a/Docs/BES-Especificação ClientFlow.docx
+++ b/Docs/BES-Especificação ClientFlow.docx
@@ -3670,24 +3670,18 @@
         </w:rPr>
         <w:t xml:space="preserve"> PBB</w:t>
       </w:r>
-      <w:bookmarkStart w:name="_Ref95112547" w:id="11"/>
       <w:bookmarkEnd w:id="10"/>
     </w:p>
     <w:p>
       <w:pPr>
         <w:pStyle w:val="Normal"/>
-        <w:keepNext w:val="1"/>
-        <w:jc w:val="center"/>
-        <w:rPr>
-          <w:noProof/>
-        </w:rPr>
       </w:pPr>
       <w:r>
         <w:drawing>
-          <wp:inline wp14:editId="7E41C393" wp14:anchorId="34FD0ED3">
-            <wp:extent cx="5400675" cy="3009900"/>
+          <wp:inline wp14:editId="2B503D09" wp14:anchorId="5999C865">
+            <wp:extent cx="5400675" cy="3028950"/>
             <wp:effectExtent l="0" t="0" r="0" b="0"/>
-            <wp:docPr id="2045987744" name="drawing"/>
+            <wp:docPr id="1939603084" name="drawing"/>
             <wp:cNvGraphicFramePr>
               <a:graphicFrameLocks noChangeAspect="1"/>
             </wp:cNvGraphicFramePr>
@@ -3695,11 +3689,11 @@
               <a:graphicData xmlns:a="http://schemas.openxmlformats.org/drawingml/2006/main" uri="http://schemas.openxmlformats.org/drawingml/2006/picture">
                 <pic:pic xmlns:pic="http://schemas.openxmlformats.org/drawingml/2006/picture">
                   <pic:nvPicPr>
-                    <pic:cNvPr id="2045987744" name="Picture 2045987744"/>
+                    <pic:cNvPr id="1939603084" name="Picture 1939603084"/>
                     <pic:cNvPicPr/>
                   </pic:nvPicPr>
                   <pic:blipFill>
-                    <a:blip xmlns:r="http://schemas.openxmlformats.org/officeDocument/2006/relationships" r:embed="rId1064255170">
+                    <a:blip xmlns:r="http://schemas.openxmlformats.org/officeDocument/2006/relationships" r:embed="rId1822898653">
                       <a:extLst>
                         <a:ext uri="{28A0092B-C50C-407E-A947-70E740481C1C}">
                           <a14:useLocalDpi xmlns:a14="http://schemas.microsoft.com/office/drawing/2010/main"/>
@@ -3713,7 +3707,7 @@
                   <pic:spPr>
                     <a:xfrm>
                       <a:off x="0" y="0"/>
-                      <a:ext cx="5400675" cy="3009900"/>
+                      <a:ext cx="5400675" cy="3028950"/>
                     </a:xfrm>
                     <a:prstGeom prst="rect">
                       <a:avLst/>
@@ -3725,6 +3719,17 @@
           </wp:inline>
         </w:drawing>
       </w:r>
+      <w:bookmarkStart w:name="_Ref95112547" w:id="11"/>
+    </w:p>
+    <w:p>
+      <w:pPr>
+        <w:pStyle w:val="Normal"/>
+        <w:keepNext w:val="1"/>
+        <w:jc w:val="center"/>
+        <w:rPr>
+          <w:noProof/>
+        </w:rPr>
+      </w:pPr>
       <w:bookmarkStart w:name="_Toc158902416" w:id="12"/>
       <w:r>
         <w:rPr>
@@ -5528,15 +5533,6 @@
             </w:r>
             <w:r>
               <w:rPr>
-                <w:b w:val="1"/>
-                <w:bCs w:val="1"/>
-                <w:color w:val="auto"/>
-                <w:highlight w:val="red"/>
-              </w:rPr>
-              <w:t xml:space="preserve"> </w:t>
-            </w:r>
-            <w:r>
-              <w:rPr>
                 <w:rFonts w:ascii="Segoe UI" w:hAnsi="Segoe UI" w:eastAsia="Segoe UI" w:cs="Segoe UI"/>
                 <w:b w:val="1"/>
                 <w:bCs w:val="1"/>
@@ -24534,8 +24530,8 @@
                 <w:smallCaps w:val="0"/>
                 <w:noProof w:val="0"/>
                 <w:color w:val="auto"/>
-                <w:sz w:val="22"/>
-                <w:szCs w:val="22"/>
+                <w:sz w:val="19"/>
+                <w:szCs w:val="19"/>
                 <w:lang w:val="pt-BR"/>
               </w:rPr>
               <w:t>link_hash</w:t>
@@ -24555,7 +24551,24 @@
                 <w:szCs w:val="19"/>
                 <w:lang w:val="pt-BR"/>
               </w:rPr>
-              <w:t xml:space="preserve"> único disponível para cópia</w:t>
+              <w:t xml:space="preserve"> </w:t>
+            </w:r>
+            <w:r>
+              <w:rPr>
+                <w:rFonts w:ascii="Segoe UI" w:hAnsi="Segoe UI" w:eastAsia="Segoe UI" w:cs="Segoe UI"/>
+                <w:b w:val="0"/>
+                <w:bCs w:val="0"/>
+                <w:i w:val="0"/>
+                <w:iCs w:val="0"/>
+                <w:caps w:val="0"/>
+                <w:smallCaps w:val="0"/>
+                <w:noProof w:val="0"/>
+                <w:color w:val="auto"/>
+                <w:sz w:val="19"/>
+                <w:szCs w:val="19"/>
+                <w:lang w:val="pt-BR"/>
+              </w:rPr>
+              <w:t>único disponível para cópia</w:t>
             </w:r>
           </w:p>
         </w:tc>
@@ -25013,8 +25026,8 @@
                 <w:smallCaps w:val="0"/>
                 <w:noProof w:val="0"/>
                 <w:color w:val="auto"/>
-                <w:sz w:val="22"/>
-                <w:szCs w:val="22"/>
+                <w:sz w:val="19"/>
+                <w:szCs w:val="19"/>
                 <w:lang w:val="pt-BR"/>
               </w:rPr>
               <w:t>cliente_id</w:t>
@@ -25481,8 +25494,8 @@
                 <w:smallCaps w:val="0"/>
                 <w:noProof w:val="0"/>
                 <w:color w:val="auto"/>
-                <w:sz w:val="22"/>
-                <w:szCs w:val="22"/>
+                <w:sz w:val="19"/>
+                <w:szCs w:val="19"/>
                 <w:lang w:val="pt-BR"/>
               </w:rPr>
               <w:t>perm_criar_projetos</w:t>
@@ -26015,8 +26028,8 @@
                 <w:smallCaps w:val="0"/>
                 <w:noProof w:val="0"/>
                 <w:color w:val="auto"/>
-                <w:sz w:val="22"/>
-                <w:szCs w:val="22"/>
+                <w:sz w:val="19"/>
+                <w:szCs w:val="19"/>
                 <w:lang w:val="pt-BR"/>
               </w:rPr>
               <w:t>perm_criar_projetos</w:t>
@@ -27278,8 +27291,8 @@
                 <w:smallCaps w:val="0"/>
                 <w:noProof w:val="0"/>
                 <w:color w:val="auto"/>
-                <w:sz w:val="22"/>
-                <w:szCs w:val="22"/>
+                <w:sz w:val="19"/>
+                <w:szCs w:val="19"/>
                 <w:lang w:val="pt-BR"/>
               </w:rPr>
               <w:t>projetos_membros</w:t>
@@ -33400,7 +33413,7 @@
                 <w:highlight w:val="green"/>
                 <w:lang w:val="pt-BR"/>
               </w:rPr>
-              <w:t xml:space="preserve"> Realizar login como administrador para acessar o painel global de controle da plataforma.</w:t>
+              <w:t>Realizar login como administrador para acessar o painel global de controle da plataforma.</w:t>
             </w:r>
           </w:p>
         </w:tc>
@@ -33839,8 +33852,8 @@
                 <w:smallCaps w:val="0"/>
                 <w:noProof w:val="0"/>
                 <w:color w:val="auto"/>
-                <w:sz w:val="22"/>
-                <w:szCs w:val="22"/>
+                <w:sz w:val="19"/>
+                <w:szCs w:val="19"/>
                 <w:lang w:val="pt-BR"/>
               </w:rPr>
               <w:t>dashboard_admin.html</w:t>
@@ -34357,6 +34370,23 @@
                 <w:lang w:val="pt-BR"/>
               </w:rPr>
               <w:t xml:space="preserve"> e impede o acesso ao painel</w:t>
+            </w:r>
+            <w:r>
+              <w:rPr>
+                <w:rFonts w:ascii="Segoe UI" w:hAnsi="Segoe UI" w:eastAsia="Segoe UI" w:cs="Segoe UI"/>
+                <w:b w:val="0"/>
+                <w:bCs w:val="0"/>
+                <w:i w:val="0"/>
+                <w:iCs w:val="0"/>
+                <w:caps w:val="0"/>
+                <w:smallCaps w:val="0"/>
+                <w:noProof w:val="0"/>
+                <w:color w:val="auto"/>
+                <w:sz w:val="19"/>
+                <w:szCs w:val="19"/>
+                <w:lang w:val="pt-BR"/>
+              </w:rPr>
+              <w:t>.</w:t>
             </w:r>
           </w:p>
         </w:tc>
@@ -34435,7 +34465,7 @@
                 <w:color w:val="auto"/>
                 <w:highlight w:val="green"/>
               </w:rPr>
-              <w:t xml:space="preserve"> - PBI:  </w:t>
+              <w:t> - PBI: </w:t>
             </w:r>
             <w:r>
               <w:rPr>
@@ -35625,406 +35655,6 @@
     </w:p>
     <w:p>
       <w:pPr>
-        <w:pStyle w:val="CorpodeTexto"/>
-        <w:rPr>
-          <w:noProof/>
-        </w:rPr>
-      </w:pPr>
-    </w:p>
-    <w:p>
-      <w:pPr>
-        <w:pStyle w:val="CorpodeTexto"/>
-        <w:rPr>
-          <w:noProof/>
-        </w:rPr>
-      </w:pPr>
-    </w:p>
-    <w:p>
-      <w:pPr>
-        <w:pStyle w:val="CorpodeTexto"/>
-        <w:rPr>
-          <w:noProof/>
-        </w:rPr>
-      </w:pPr>
-    </w:p>
-    <w:p>
-      <w:pPr>
-        <w:pStyle w:val="CorpodeTexto"/>
-        <w:rPr>
-          <w:noProof/>
-        </w:rPr>
-      </w:pPr>
-    </w:p>
-    <w:p>
-      <w:pPr>
-        <w:pStyle w:val="CorpodeTexto"/>
-        <w:rPr>
-          <w:noProof/>
-        </w:rPr>
-      </w:pPr>
-    </w:p>
-    <w:p>
-      <w:pPr>
-        <w:pStyle w:val="CorpodeTexto"/>
-        <w:rPr>
-          <w:noProof/>
-        </w:rPr>
-      </w:pPr>
-    </w:p>
-    <w:p>
-      <w:pPr>
-        <w:pStyle w:val="CorpodeTexto"/>
-        <w:rPr>
-          <w:noProof/>
-        </w:rPr>
-      </w:pPr>
-    </w:p>
-    <w:p>
-      <w:pPr>
-        <w:pStyle w:val="CorpodeTexto"/>
-        <w:rPr>
-          <w:noProof/>
-        </w:rPr>
-      </w:pPr>
-    </w:p>
-    <w:p>
-      <w:pPr>
-        <w:pStyle w:val="CorpodeTexto"/>
-        <w:rPr>
-          <w:noProof/>
-        </w:rPr>
-      </w:pPr>
-    </w:p>
-    <w:p>
-      <w:pPr>
-        <w:pStyle w:val="CorpodeTexto"/>
-        <w:rPr>
-          <w:noProof/>
-        </w:rPr>
-      </w:pPr>
-    </w:p>
-    <w:p>
-      <w:pPr>
-        <w:pStyle w:val="CorpodeTexto"/>
-        <w:rPr>
-          <w:noProof/>
-        </w:rPr>
-      </w:pPr>
-    </w:p>
-    <w:p>
-      <w:pPr>
-        <w:pStyle w:val="CorpodeTexto"/>
-        <w:rPr>
-          <w:noProof/>
-        </w:rPr>
-      </w:pPr>
-    </w:p>
-    <w:p>
-      <w:pPr>
-        <w:pStyle w:val="CorpodeTexto"/>
-        <w:rPr>
-          <w:noProof/>
-        </w:rPr>
-      </w:pPr>
-    </w:p>
-    <w:p>
-      <w:pPr>
-        <w:pStyle w:val="CorpodeTexto"/>
-        <w:rPr>
-          <w:noProof/>
-        </w:rPr>
-      </w:pPr>
-    </w:p>
-    <w:p>
-      <w:pPr>
-        <w:pStyle w:val="CorpodeTexto"/>
-        <w:rPr>
-          <w:noProof/>
-        </w:rPr>
-      </w:pPr>
-    </w:p>
-    <w:p>
-      <w:pPr>
-        <w:pStyle w:val="CorpodeTexto"/>
-        <w:rPr>
-          <w:noProof/>
-        </w:rPr>
-      </w:pPr>
-    </w:p>
-    <w:p>
-      <w:pPr>
-        <w:pStyle w:val="CorpodeTexto"/>
-        <w:rPr>
-          <w:noProof/>
-        </w:rPr>
-      </w:pPr>
-    </w:p>
-    <w:p>
-      <w:pPr>
-        <w:pStyle w:val="CorpodeTexto"/>
-        <w:rPr>
-          <w:noProof/>
-        </w:rPr>
-      </w:pPr>
-    </w:p>
-    <w:p>
-      <w:pPr>
-        <w:pStyle w:val="CorpodeTexto"/>
-        <w:rPr>
-          <w:noProof/>
-        </w:rPr>
-      </w:pPr>
-    </w:p>
-    <w:p>
-      <w:pPr>
-        <w:pStyle w:val="CorpodeTexto"/>
-        <w:rPr>
-          <w:noProof/>
-        </w:rPr>
-      </w:pPr>
-    </w:p>
-    <w:p>
-      <w:pPr>
-        <w:pStyle w:val="CorpodeTexto"/>
-        <w:rPr>
-          <w:noProof/>
-        </w:rPr>
-      </w:pPr>
-    </w:p>
-    <w:p>
-      <w:pPr>
-        <w:pStyle w:val="CorpodeTexto"/>
-        <w:rPr>
-          <w:noProof/>
-        </w:rPr>
-      </w:pPr>
-    </w:p>
-    <w:p>
-      <w:pPr>
-        <w:pStyle w:val="CorpodeTexto"/>
-        <w:rPr>
-          <w:noProof/>
-        </w:rPr>
-      </w:pPr>
-    </w:p>
-    <w:p>
-      <w:pPr>
-        <w:pStyle w:val="CorpodeTexto"/>
-        <w:rPr>
-          <w:noProof/>
-        </w:rPr>
-      </w:pPr>
-    </w:p>
-    <w:p>
-      <w:pPr>
-        <w:pStyle w:val="CorpodeTexto"/>
-        <w:rPr>
-          <w:noProof/>
-        </w:rPr>
-      </w:pPr>
-    </w:p>
-    <w:p>
-      <w:pPr>
-        <w:pStyle w:val="CorpodeTexto"/>
-        <w:rPr>
-          <w:noProof/>
-        </w:rPr>
-      </w:pPr>
-    </w:p>
-    <w:p>
-      <w:pPr>
-        <w:pStyle w:val="CorpodeTexto"/>
-        <w:rPr>
-          <w:noProof/>
-        </w:rPr>
-      </w:pPr>
-    </w:p>
-    <w:p>
-      <w:pPr>
-        <w:pStyle w:val="CorpodeTexto"/>
-        <w:rPr>
-          <w:noProof/>
-        </w:rPr>
-      </w:pPr>
-    </w:p>
-    <w:p>
-      <w:pPr>
-        <w:pStyle w:val="CorpodeTexto"/>
-        <w:rPr>
-          <w:noProof/>
-        </w:rPr>
-      </w:pPr>
-    </w:p>
-    <w:p>
-      <w:pPr>
-        <w:pStyle w:val="CorpodeTexto"/>
-        <w:rPr>
-          <w:noProof/>
-        </w:rPr>
-      </w:pPr>
-    </w:p>
-    <w:p>
-      <w:pPr>
-        <w:pStyle w:val="CorpodeTexto"/>
-        <w:rPr>
-          <w:noProof/>
-        </w:rPr>
-      </w:pPr>
-    </w:p>
-    <w:p>
-      <w:pPr>
-        <w:pStyle w:val="CorpodeTexto"/>
-        <w:rPr>
-          <w:noProof/>
-        </w:rPr>
-      </w:pPr>
-    </w:p>
-    <w:p>
-      <w:pPr>
-        <w:pStyle w:val="CorpodeTexto"/>
-        <w:rPr>
-          <w:noProof/>
-        </w:rPr>
-      </w:pPr>
-    </w:p>
-    <w:p>
-      <w:pPr>
-        <w:pStyle w:val="CorpodeTexto"/>
-        <w:rPr>
-          <w:noProof/>
-        </w:rPr>
-      </w:pPr>
-    </w:p>
-    <w:p>
-      <w:pPr>
-        <w:pStyle w:val="CorpodeTexto"/>
-        <w:rPr>
-          <w:noProof/>
-        </w:rPr>
-      </w:pPr>
-    </w:p>
-    <w:p>
-      <w:pPr>
-        <w:pStyle w:val="CorpodeTexto"/>
-        <w:rPr>
-          <w:noProof/>
-        </w:rPr>
-      </w:pPr>
-    </w:p>
-    <w:p>
-      <w:pPr>
-        <w:pStyle w:val="CorpodeTexto"/>
-        <w:rPr>
-          <w:noProof/>
-        </w:rPr>
-      </w:pPr>
-    </w:p>
-    <w:p>
-      <w:pPr>
-        <w:pStyle w:val="CorpodeTexto"/>
-        <w:rPr>
-          <w:noProof/>
-        </w:rPr>
-      </w:pPr>
-    </w:p>
-    <w:p>
-      <w:pPr>
-        <w:pStyle w:val="CorpodeTexto"/>
-        <w:rPr>
-          <w:noProof/>
-        </w:rPr>
-      </w:pPr>
-    </w:p>
-    <w:p>
-      <w:pPr>
-        <w:pStyle w:val="CorpodeTexto"/>
-        <w:rPr>
-          <w:noProof/>
-        </w:rPr>
-      </w:pPr>
-    </w:p>
-    <w:p>
-      <w:pPr>
-        <w:pStyle w:val="CorpodeTexto"/>
-        <w:rPr>
-          <w:noProof/>
-        </w:rPr>
-      </w:pPr>
-    </w:p>
-    <w:p>
-      <w:pPr>
-        <w:pStyle w:val="CorpodeTexto"/>
-        <w:rPr>
-          <w:noProof/>
-        </w:rPr>
-      </w:pPr>
-    </w:p>
-    <w:p>
-      <w:pPr>
-        <w:pStyle w:val="CorpodeTexto"/>
-        <w:rPr>
-          <w:noProof/>
-        </w:rPr>
-      </w:pPr>
-    </w:p>
-    <w:p>
-      <w:pPr>
-        <w:pStyle w:val="CorpodeTexto"/>
-        <w:rPr>
-          <w:noProof/>
-        </w:rPr>
-      </w:pPr>
-    </w:p>
-    <w:p>
-      <w:pPr>
-        <w:pStyle w:val="CorpodeTexto"/>
-        <w:rPr>
-          <w:noProof/>
-        </w:rPr>
-      </w:pPr>
-    </w:p>
-    <w:p>
-      <w:pPr>
-        <w:pStyle w:val="CorpodeTexto"/>
-        <w:rPr>
-          <w:noProof/>
-        </w:rPr>
-      </w:pPr>
-    </w:p>
-    <w:p>
-      <w:pPr>
-        <w:pStyle w:val="CorpodeTexto"/>
-        <w:rPr>
-          <w:noProof/>
-        </w:rPr>
-      </w:pPr>
-    </w:p>
-    <w:p>
-      <w:pPr>
-        <w:pStyle w:val="CorpodeTexto"/>
-        <w:rPr>
-          <w:noProof/>
-        </w:rPr>
-      </w:pPr>
-    </w:p>
-    <w:p>
-      <w:pPr>
-        <w:pStyle w:val="CorpodeTexto"/>
-        <w:rPr>
-          <w:noProof/>
-        </w:rPr>
-      </w:pPr>
-    </w:p>
-    <w:p>
-      <w:pPr>
-        <w:pStyle w:val="CorpodeTexto"/>
-        <w:rPr>
-          <w:noProof/>
-        </w:rPr>
-      </w:pPr>
-    </w:p>
-    <w:p>
-      <w:pPr>
         <w:pStyle w:val="Ttulo1"/>
       </w:pPr>
       <w:bookmarkStart w:name="_Toc158902409" w:id="20"/>
@@ -36225,260 +35855,6 @@
     <w:p/>
     <w:p/>
     <w:p/>
-    <w:p/>
-    <w:p/>
-    <w:p/>
-    <w:p/>
-    <w:p/>
-    <w:p/>
-    <w:p/>
-    <w:p/>
-    <w:p>
-      <w:pPr>
-        <w:pStyle w:val="Ttulo1"/>
-      </w:pPr>
-      <w:bookmarkStart w:name="_Toc158902410" w:id="23"/>
-      <w:r>
-        <w:t>ARTEFATO</w:t>
-      </w:r>
-      <w:r>
-        <w:t xml:space="preserve"> </w:t>
-      </w:r>
-      <w:r>
-        <w:t>7</w:t>
-      </w:r>
-      <w:r>
-        <w:t>:</w:t>
-      </w:r>
-      <w:r>
-        <w:t xml:space="preserve"> Diagrama de Classe</w:t>
-      </w:r>
-      <w:bookmarkEnd w:id="23"/>
-    </w:p>
-    <w:p/>
-    <w:tbl>
-      <w:tblPr>
-        <w:tblStyle w:val="Tabelacomgrade"/>
-        <w:tblW w:w="8494" w:type="dxa"/>
-        <w:tblLook w:val="04A0" w:firstRow="1" w:lastRow="0" w:firstColumn="1" w:lastColumn="0" w:noHBand="0" w:noVBand="1"/>
-      </w:tblPr>
-      <w:tblGrid>
-        <w:gridCol w:w="8494"/>
-      </w:tblGrid>
-      <w:tr>
-        <w:trPr>
-          <w:trHeight w:val="375"/>
-        </w:trPr>
-        <w:tc>
-          <w:tcPr>
-            <w:tcW w:w="8494" w:type="dxa"/>
-            <w:vAlign w:val="center"/>
-          </w:tcPr>
-          <w:p>
-            <w:r>
-              <w:rPr>
-                <w:b/>
-                <w:bCs/>
-              </w:rPr>
-              <w:t xml:space="preserve">ARTEFATO </w:t>
-            </w:r>
-            <w:r>
-              <w:rPr>
-                <w:b/>
-                <w:bCs/>
-              </w:rPr>
-              <w:t>7</w:t>
-            </w:r>
-            <w:r>
-              <w:rPr>
-                <w:b/>
-                <w:bCs/>
-              </w:rPr>
-              <w:t xml:space="preserve">: </w:t>
-            </w:r>
-            <w:r>
-              <w:t>Diagrama de Classes</w:t>
-            </w:r>
-          </w:p>
-        </w:tc>
-      </w:tr>
-      <w:tr>
-        <w:trPr>
-          <w:trHeight w:val="375"/>
-        </w:trPr>
-        <w:tc>
-          <w:tcPr>
-            <w:tcW w:w="8494" w:type="dxa"/>
-            <w:vAlign w:val="center"/>
-          </w:tcPr>
-          <w:p>
-            <w:pPr>
-              <w:jc w:val="center"/>
-              <w:rPr>
-                <w:b/>
-                <w:bCs/>
-              </w:rPr>
-            </w:pPr>
-          </w:p>
-          <w:p>
-            <w:pPr>
-              <w:jc w:val="center"/>
-              <w:rPr>
-                <w:b/>
-                <w:bCs/>
-              </w:rPr>
-            </w:pPr>
-            <w:r>
-              <w:rPr>
-                <w:noProof/>
-              </w:rPr>
-              <w:drawing>
-                <wp:inline distT="0" distB="0" distL="0" distR="0" wp14:anchorId="2FDC8065" wp14:editId="5F4DCC4D">
-                  <wp:extent cx="4245567" cy="4921440"/>
-                  <wp:effectExtent l="0" t="0" r="3175" b="0"/>
-                  <wp:docPr id="50" name="Imagem 50" descr="Diagrama&#10;&#10;Descrição gerada automaticamente"/>
-                  <wp:cNvGraphicFramePr>
-                    <a:graphicFrameLocks xmlns:a="http://schemas.openxmlformats.org/drawingml/2006/main" noChangeAspect="1"/>
-                  </wp:cNvGraphicFramePr>
-                  <a:graphic xmlns:a="http://schemas.openxmlformats.org/drawingml/2006/main">
-                    <a:graphicData uri="http://schemas.openxmlformats.org/drawingml/2006/picture">
-                      <pic:pic xmlns:pic="http://schemas.openxmlformats.org/drawingml/2006/picture">
-                        <pic:nvPicPr>
-                          <pic:cNvPr id="50" name="Imagem 50" descr="Diagrama&#10;&#10;Descrição gerada automaticamente"/>
-                          <pic:cNvPicPr>
-                            <a:picLocks noChangeAspect="1" noChangeArrowheads="1"/>
-                          </pic:cNvPicPr>
-                        </pic:nvPicPr>
-                        <pic:blipFill rotWithShape="1">
-                          <a:blip r:embed="rId13">
-                            <a:extLst>
-                              <a:ext uri="{28A0092B-C50C-407E-A947-70E740481C1C}">
-                                <a14:useLocalDpi xmlns:a14="http://schemas.microsoft.com/office/drawing/2010/main" val="0"/>
-                              </a:ext>
-                            </a:extLst>
-                          </a:blip>
-                          <a:srcRect r="9631" b="5955"/>
-                          <a:stretch/>
-                        </pic:blipFill>
-                        <pic:spPr bwMode="auto">
-                          <a:xfrm>
-                            <a:off x="0" y="0"/>
-                            <a:ext cx="4262053" cy="4940550"/>
-                          </a:xfrm>
-                          <a:prstGeom prst="rect">
-                            <a:avLst/>
-                          </a:prstGeom>
-                          <a:noFill/>
-                          <a:ln w="9525" cap="flat" cmpd="sng" algn="ctr">
-                            <a:noFill/>
-                            <a:prstDash val="solid"/>
-                            <a:round/>
-                            <a:headEnd type="none" w="med" len="med"/>
-                            <a:tailEnd type="none" w="med" len="med"/>
-                            <a:extLst>
-                              <a:ext uri="{C807C97D-BFC1-408E-A445-0C87EB9F89A2}">
-                                <ask:lineSketchStyleProps xmlns:ask="http://schemas.microsoft.com/office/drawing/2018/sketchyshapes" sd="0">
-                                  <a:custGeom>
-                                    <a:avLst/>
-                                    <a:gdLst/>
-                                    <a:ahLst/>
-                                    <a:cxnLst/>
-                                    <a:rect l="0" t="0" r="0" b="0"/>
-                                    <a:pathLst/>
-                                  </a:custGeom>
-                                  <ask:type/>
-                                </ask:lineSketchStyleProps>
-                              </a:ext>
-                            </a:extLst>
-                          </a:ln>
-                          <a:extLst>
-                            <a:ext uri="{53640926-AAD7-44D8-BBD7-CCE9431645EC}">
-                              <a14:shadowObscured xmlns:a14="http://schemas.microsoft.com/office/drawing/2010/main"/>
-                            </a:ext>
-                          </a:extLst>
-                        </pic:spPr>
-                      </pic:pic>
-                    </a:graphicData>
-                  </a:graphic>
-                </wp:inline>
-              </w:drawing>
-            </w:r>
-          </w:p>
-          <w:p>
-            <w:pPr>
-              <w:jc w:val="center"/>
-              <w:rPr>
-                <w:b/>
-                <w:bCs/>
-              </w:rPr>
-            </w:pPr>
-          </w:p>
-        </w:tc>
-      </w:tr>
-    </w:tbl>
-    <w:p>
-      <w:pPr>
-        <w:pStyle w:val="Legenda"/>
-        <w:spacing w:before="120"/>
-      </w:pPr>
-      <w:bookmarkStart w:name="_Toc96277162" w:id="24"/>
-      <w:bookmarkStart w:name="_Toc158902419" w:id="25"/>
-      <w:r>
-        <w:t xml:space="preserve">Figura </w:t>
-      </w:r>
-      <w:r>
-        <w:fldChar w:fldCharType="begin"/>
-      </w:r>
-      <w:r>
-        <w:instrText>SEQ Figura \* ARABIC</w:instrText>
-      </w:r>
-      <w:r>
-        <w:fldChar w:fldCharType="separate"/>
-      </w:r>
-      <w:r>
-        <w:rPr>
-          <w:noProof/>
-        </w:rPr>
-        <w:t>7</w:t>
-      </w:r>
-      <w:r>
-        <w:fldChar w:fldCharType="end"/>
-      </w:r>
-      <w:r>
-        <w:t xml:space="preserve"> </w:t>
-      </w:r>
-      <w:r>
-        <w:t>–</w:t>
-      </w:r>
-      <w:r>
-        <w:t xml:space="preserve"> Exemplo</w:t>
-      </w:r>
-      <w:r>
-        <w:t>:</w:t>
-      </w:r>
-      <w:r>
-        <w:t xml:space="preserve"> </w:t>
-      </w:r>
-      <w:r>
-        <w:t>D</w:t>
-      </w:r>
-      <w:r>
-        <w:t xml:space="preserve">iagrama de </w:t>
-      </w:r>
-      <w:r>
-        <w:t>C</w:t>
-      </w:r>
-      <w:r>
-        <w:t>lasses.</w:t>
-      </w:r>
-      <w:bookmarkEnd w:id="24"/>
-      <w:bookmarkEnd w:id="25"/>
-    </w:p>
-    <w:p>
-      <w:pPr>
-        <w:pStyle w:val="CorpodeTexto"/>
-      </w:pPr>
-    </w:p>
     <w:p>
       <w:pPr>
         <w:pStyle w:val="Ttulo1"/>
@@ -36488,6 +35864,43 @@
       <w:pPr>
         <w:pStyle w:val="Ttulo1"/>
       </w:pPr>
+      <w:bookmarkStart w:name="_Toc158902410" w:id="23"/>
+      <w:r>
+        <w:rPr/>
+        <w:t>ARTEFATO</w:t>
+      </w:r>
+      <w:r>
+        <w:rPr/>
+        <w:t xml:space="preserve"> </w:t>
+      </w:r>
+      <w:r>
+        <w:rPr/>
+        <w:t>7</w:t>
+      </w:r>
+      <w:r>
+        <w:rPr/>
+        <w:t>:</w:t>
+      </w:r>
+      <w:r>
+        <w:rPr/>
+        <w:t xml:space="preserve"> Diagrama de Classe</w:t>
+      </w:r>
+      <w:r>
+        <w:rPr/>
+        <w:t>s (</w:t>
+      </w:r>
+      <w:r>
+        <w:rPr>
+          <w:b w:val="1"/>
+          <w:bCs w:val="1"/>
+        </w:rPr>
+        <w:t>Não Utilizado</w:t>
+      </w:r>
+      <w:r>
+        <w:rPr/>
+        <w:t>)</w:t>
+      </w:r>
+      <w:bookmarkEnd w:id="23"/>
     </w:p>
     <w:p>
       <w:pPr>
@@ -36496,7 +35909,7 @@
     </w:p>
     <w:p>
       <w:pPr>
-        <w:pStyle w:val="Ttulo1"/>
+        <w:pStyle w:val="Normal"/>
       </w:pPr>
     </w:p>
     <w:p>
@@ -36505,13 +35918,16 @@
       </w:pPr>
       <w:bookmarkStart w:name="_Toc158902411" w:id="26"/>
       <w:r>
+        <w:rPr/>
         <w:t xml:space="preserve">ARTEFATO 8: </w:t>
       </w:r>
       <w:r>
+        <w:rPr/>
         <w:t>Diagrama de Atividades</w:t>
       </w:r>
       <w:bookmarkEnd w:id="26"/>
       <w:r>
+        <w:rPr/>
         <w:t xml:space="preserve"> </w:t>
       </w:r>
     </w:p>

</xml_diff>

<commit_message>
docs:Adiciona Versão completa de toda a documentação
</commit_message>
<xml_diff>
--- a/Docs/BES-Especificação ClientFlow.docx
+++ b/Docs/BES-Especificação ClientFlow.docx
@@ -35683,6 +35683,7 @@
         <w:tc>
           <w:tcPr>
             <w:tcW w:w="8494" w:type="dxa"/>
+            <w:tcMar/>
             <w:vAlign w:val="center"/>
           </w:tcPr>
           <w:p>
@@ -35723,6 +35724,7 @@
         <w:tc>
           <w:tcPr>
             <w:tcW w:w="8494" w:type="dxa"/>
+            <w:tcMar/>
             <w:vAlign w:val="center"/>
           </w:tcPr>
           <w:p>
@@ -35736,29 +35738,27 @@
           </w:p>
           <w:p>
             <w:pPr>
+              <w:pStyle w:val="Normal"/>
               <w:jc w:val="center"/>
             </w:pPr>
             <w:r>
-              <w:rPr>
-                <w:noProof/>
-              </w:rPr>
               <w:drawing>
-                <wp:inline distT="0" distB="0" distL="0" distR="0" wp14:anchorId="2842A44A" wp14:editId="0F34B735">
-                  <wp:extent cx="5248275" cy="3171825"/>
+                <wp:inline wp14:editId="0F9BFFB0" wp14:anchorId="4941BADC">
+                  <wp:extent cx="4267200" cy="5248275"/>
                   <wp:effectExtent l="0" t="0" r="0" b="0"/>
-                  <wp:docPr id="1480492328" name="drawing"/>
+                  <wp:docPr id="577542417" name="drawing"/>
                   <wp:cNvGraphicFramePr>
-                    <a:graphicFrameLocks xmlns:a="http://schemas.openxmlformats.org/drawingml/2006/main" noChangeAspect="1"/>
+                    <a:graphicFrameLocks noChangeAspect="1"/>
                   </wp:cNvGraphicFramePr>
-                  <a:graphic xmlns:a="http://schemas.openxmlformats.org/drawingml/2006/main">
-                    <a:graphicData uri="http://schemas.openxmlformats.org/drawingml/2006/picture">
+                  <a:graphic>
+                    <a:graphicData xmlns:a="http://schemas.openxmlformats.org/drawingml/2006/main" uri="http://schemas.openxmlformats.org/drawingml/2006/picture">
                       <pic:pic xmlns:pic="http://schemas.openxmlformats.org/drawingml/2006/picture">
                         <pic:nvPicPr>
-                          <pic:cNvPr id="1480492328" name="Picture 1480492328"/>
+                          <pic:cNvPr id="577542417" name="Picture 577542417"/>
                           <pic:cNvPicPr/>
                         </pic:nvPicPr>
                         <pic:blipFill>
-                          <a:blip r:embed="rId12">
+                          <a:blip xmlns:r="http://schemas.openxmlformats.org/officeDocument/2006/relationships" r:embed="rId706581178">
                             <a:extLst>
                               <a:ext uri="{28A0092B-C50C-407E-A947-70E740481C1C}">
                                 <a14:useLocalDpi xmlns:a14="http://schemas.microsoft.com/office/drawing/2010/main"/>
@@ -35772,7 +35772,7 @@
                         <pic:spPr>
                           <a:xfrm>
                             <a:off x="0" y="0"/>
-                            <a:ext cx="5248275" cy="3171825"/>
+                            <a:ext cx="4267200" cy="5248275"/>
                           </a:xfrm>
                           <a:prstGeom prst="rect">
                             <a:avLst/>
@@ -35852,9 +35852,6 @@
       <w:bookmarkEnd w:id="21"/>
       <w:bookmarkEnd w:id="22"/>
     </w:p>
-    <w:p/>
-    <w:p/>
-    <w:p/>
     <w:p>
       <w:pPr>
         <w:pStyle w:val="Ttulo1"/>
@@ -35904,11 +35901,6 @@
     </w:p>
     <w:p>
       <w:pPr>
-        <w:pStyle w:val="Ttulo1"/>
-      </w:pPr>
-    </w:p>
-    <w:p>
-      <w:pPr>
         <w:pStyle w:val="Normal"/>
       </w:pPr>
     </w:p>
@@ -35948,6 +35940,7 @@
         <w:tc>
           <w:tcPr>
             <w:tcW w:w="8494" w:type="dxa"/>
+            <w:tcMar/>
             <w:vAlign w:val="center"/>
           </w:tcPr>
           <w:p>
@@ -35988,6 +35981,7 @@
         <w:tc>
           <w:tcPr>
             <w:tcW w:w="8494" w:type="dxa"/>
+            <w:tcMar/>
             <w:vAlign w:val="center"/>
           </w:tcPr>
           <w:p>
@@ -36002,68 +35996,43 @@
           <w:p>
             <w:pPr>
               <w:jc w:val="center"/>
-              <w:rPr>
-                <w:b/>
-                <w:bCs/>
-              </w:rPr>
-            </w:pPr>
-            <w:r>
-              <w:rPr>
-                <w:b/>
-                <w:bCs/>
-                <w:noProof/>
-              </w:rPr>
+            </w:pPr>
+            <w:r>
               <w:drawing>
-                <wp:inline distT="0" distB="0" distL="0" distR="0" wp14:anchorId="5CAE2FD8" wp14:editId="677C6024">
-                  <wp:extent cx="4088118" cy="4015408"/>
-                  <wp:effectExtent l="0" t="0" r="8255" b="4445"/>
-                  <wp:docPr id="7" name="Imagem 7"/>
+                <wp:inline wp14:editId="624103EB" wp14:anchorId="3AA282A6">
+                  <wp:extent cx="3819525" cy="5248275"/>
+                  <wp:effectExtent l="0" t="0" r="0" b="0"/>
+                  <wp:docPr id="190035795" name="drawing"/>
                   <wp:cNvGraphicFramePr>
-                    <a:graphicFrameLocks xmlns:a="http://schemas.openxmlformats.org/drawingml/2006/main" noChangeAspect="1"/>
+                    <a:graphicFrameLocks noChangeAspect="1"/>
                   </wp:cNvGraphicFramePr>
-                  <a:graphic xmlns:a="http://schemas.openxmlformats.org/drawingml/2006/main">
-                    <a:graphicData uri="http://schemas.openxmlformats.org/drawingml/2006/picture">
+                  <a:graphic>
+                    <a:graphicData xmlns:a="http://schemas.openxmlformats.org/drawingml/2006/main" uri="http://schemas.openxmlformats.org/drawingml/2006/picture">
                       <pic:pic xmlns:pic="http://schemas.openxmlformats.org/drawingml/2006/picture">
                         <pic:nvPicPr>
-                          <pic:cNvPr id="0" name="Picture 24"/>
-                          <pic:cNvPicPr>
-                            <a:picLocks noChangeAspect="1" noChangeArrowheads="1"/>
-                          </pic:cNvPicPr>
+                          <pic:cNvPr id="190035795" name="Picture 190035795"/>
+                          <pic:cNvPicPr/>
                         </pic:nvPicPr>
                         <pic:blipFill>
-                          <a:blip r:embed="rId14">
+                          <a:blip xmlns:r="http://schemas.openxmlformats.org/officeDocument/2006/relationships" r:embed="rId1333310075">
                             <a:extLst>
-                              <a:ext uri="{BEBA8EAE-BF5A-486C-A8C5-ECC9F3942E4B}">
-                                <a14:imgProps xmlns:a14="http://schemas.microsoft.com/office/drawing/2010/main">
-                                  <a14:imgLayer r:embed="rId15">
-                                    <a14:imgEffect>
-                                      <a14:saturation sat="200000"/>
-                                    </a14:imgEffect>
-                                  </a14:imgLayer>
-                                </a14:imgProps>
-                              </a:ext>
                               <a:ext uri="{28A0092B-C50C-407E-A947-70E740481C1C}">
-                                <a14:useLocalDpi xmlns:a14="http://schemas.microsoft.com/office/drawing/2010/main" val="0"/>
+                                <a14:useLocalDpi xmlns:a14="http://schemas.microsoft.com/office/drawing/2010/main"/>
                               </a:ext>
                             </a:extLst>
                           </a:blip>
-                          <a:srcRect/>
                           <a:stretch>
                             <a:fillRect/>
                           </a:stretch>
                         </pic:blipFill>
-                        <pic:spPr bwMode="auto">
+                        <pic:spPr>
                           <a:xfrm>
                             <a:off x="0" y="0"/>
-                            <a:ext cx="4097185" cy="4024314"/>
+                            <a:ext cx="3819525" cy="5248275"/>
                           </a:xfrm>
                           <a:prstGeom prst="rect">
                             <a:avLst/>
                           </a:prstGeom>
-                          <a:noFill/>
-                          <a:ln>
-                            <a:noFill/>
-                          </a:ln>
                         </pic:spPr>
                       </pic:pic>
                     </a:graphicData>

</xml_diff>